<commit_message>
SPA refactor and CSS step
</commit_message>
<xml_diff>
--- a/NOTES PRESSUR.docx
+++ b/NOTES PRESSUR.docx
@@ -97,6 +97,9 @@
     </w:p>
     <w:p>
       <w:r>
+        <w:rPr>
+          <w:noProof/>
+        </w:rPr>
         <w:drawing>
           <wp:inline distT="0" distB="0" distL="0" distR="0" wp14:anchorId="59379D3E" wp14:editId="15E59FC6">
             <wp:extent cx="5731510" cy="1695450"/>
@@ -141,19 +144,7 @@
           <w:rPr>
             <w:rStyle w:val="Hyperlink"/>
           </w:rPr>
-          <w:t>Audio</w:t>
-        </w:r>
-        <w:r>
-          <w:rPr>
-            <w:rStyle w:val="Hyperlink"/>
-          </w:rPr>
-          <w:t>M</w:t>
-        </w:r>
-        <w:r>
-          <w:rPr>
-            <w:rStyle w:val="Hyperlink"/>
-          </w:rPr>
-          <w:t>otion</w:t>
+          <w:t>AudioMotion</w:t>
         </w:r>
         <w:proofErr w:type="spellEnd"/>
       </w:hyperlink>
@@ -161,6 +152,9 @@
         <w:br/>
       </w:r>
       <w:r>
+        <w:rPr>
+          <w:noProof/>
+        </w:rPr>
         <w:drawing>
           <wp:inline distT="0" distB="0" distL="0" distR="0" wp14:anchorId="6F5261AA" wp14:editId="5E524D63">
             <wp:extent cx="5731510" cy="3013075"/>
@@ -307,7 +301,15 @@
         </w:numPr>
       </w:pPr>
       <w:r>
-        <w:t>An account (overlay) page - This has detailed analytics overlayed over a heart icon, as well as an overview of favourited songs/sessions etc. The exact shape will be decided later, it can be a placeholder for now. I mentioned "overlay" because I want users t</w:t>
+        <w:t xml:space="preserve">An account (overlay) page - This has detailed analytics overlayed over a heart icon, as well as an overview of favourited songs/sessions etc. The exact shape will be decided </w:t>
+      </w:r>
+      <w:proofErr w:type="gramStart"/>
+      <w:r>
+        <w:t>later,</w:t>
+      </w:r>
+      <w:proofErr w:type="gramEnd"/>
+      <w:r>
+        <w:t xml:space="preserve"> it can be a placeholder for now. I mentioned "overlay" because I want users t</w:t>
       </w:r>
       <w:r>
         <w:t xml:space="preserve">o </w:t>
@@ -316,6 +318,1051 @@
         <w:t>be able to look at their analytics while the music/session keeps going.</w:t>
       </w:r>
     </w:p>
+    <w:p/>
+    <w:p>
+      <w:r>
+        <w:t>Next:</w:t>
+      </w:r>
+    </w:p>
+    <w:p>
+      <w:r>
+        <w:t>I want to change the naming convention for tracks to get prettier titles:</w:t>
+      </w:r>
+    </w:p>
+    <w:p>
+      <w:r>
+        <w:t>"</w:t>
+      </w:r>
+    </w:p>
+    <w:p>
+      <w:r>
+        <w:t>&lt;script&gt;</w:t>
+      </w:r>
+    </w:p>
+    <w:p>
+      <w:r>
+        <w:t xml:space="preserve">        </w:t>
+      </w:r>
+      <w:proofErr w:type="spellStart"/>
+      <w:proofErr w:type="gramStart"/>
+      <w:r>
+        <w:t>document.addEventListener</w:t>
+      </w:r>
+      <w:proofErr w:type="spellEnd"/>
+      <w:proofErr w:type="gramEnd"/>
+      <w:r>
+        <w:t>('</w:t>
+      </w:r>
+      <w:proofErr w:type="spellStart"/>
+      <w:r>
+        <w:t>DOMContentLoaded</w:t>
+      </w:r>
+      <w:proofErr w:type="spellEnd"/>
+      <w:r>
+        <w:t>', () =&gt; {</w:t>
+      </w:r>
+    </w:p>
+    <w:p>
+      <w:r>
+        <w:t>            fetch('</w:t>
+      </w:r>
+      <w:proofErr w:type="spellStart"/>
+      <w:proofErr w:type="gramStart"/>
+      <w:r>
+        <w:t>library.json</w:t>
+      </w:r>
+      <w:proofErr w:type="spellEnd"/>
+      <w:proofErr w:type="gramEnd"/>
+      <w:r>
+        <w:t>')</w:t>
+      </w:r>
+    </w:p>
+    <w:p>
+      <w:r>
+        <w:t xml:space="preserve">                </w:t>
+      </w:r>
+      <w:proofErr w:type="gramStart"/>
+      <w:r>
+        <w:t>.then</w:t>
+      </w:r>
+      <w:proofErr w:type="gramEnd"/>
+      <w:r>
+        <w:t xml:space="preserve">(response =&gt; </w:t>
+      </w:r>
+      <w:proofErr w:type="spellStart"/>
+      <w:proofErr w:type="gramStart"/>
+      <w:r>
+        <w:t>response.json</w:t>
+      </w:r>
+      <w:proofErr w:type="spellEnd"/>
+      <w:proofErr w:type="gramEnd"/>
+      <w:r>
+        <w:t>())</w:t>
+      </w:r>
+    </w:p>
+    <w:p>
+      <w:r>
+        <w:t xml:space="preserve">                </w:t>
+      </w:r>
+      <w:proofErr w:type="gramStart"/>
+      <w:r>
+        <w:t>.then</w:t>
+      </w:r>
+      <w:proofErr w:type="gramEnd"/>
+      <w:r>
+        <w:t xml:space="preserve">(data =&gt; </w:t>
+      </w:r>
+      <w:proofErr w:type="spellStart"/>
+      <w:r>
+        <w:t>renderCategories</w:t>
+      </w:r>
+      <w:proofErr w:type="spellEnd"/>
+      <w:r>
+        <w:t>(data))</w:t>
+      </w:r>
+    </w:p>
+    <w:p>
+      <w:r>
+        <w:t xml:space="preserve">                </w:t>
+      </w:r>
+      <w:proofErr w:type="gramStart"/>
+      <w:r>
+        <w:t>.catch</w:t>
+      </w:r>
+      <w:proofErr w:type="gramEnd"/>
+      <w:r>
+        <w:t xml:space="preserve">(error =&gt; </w:t>
+      </w:r>
+      <w:proofErr w:type="spellStart"/>
+      <w:proofErr w:type="gramStart"/>
+      <w:r>
+        <w:t>console.error</w:t>
+      </w:r>
+      <w:proofErr w:type="spellEnd"/>
+      <w:proofErr w:type="gramEnd"/>
+      <w:r>
+        <w:t>('Error loading library:', error));</w:t>
+      </w:r>
+    </w:p>
+    <w:p>
+      <w:r>
+        <w:t xml:space="preserve">            </w:t>
+      </w:r>
+      <w:proofErr w:type="spellStart"/>
+      <w:r>
+        <w:t>const</w:t>
+      </w:r>
+      <w:proofErr w:type="spellEnd"/>
+      <w:r>
+        <w:t xml:space="preserve"> user = </w:t>
+      </w:r>
+      <w:proofErr w:type="spellStart"/>
+      <w:r>
+        <w:t>Session.getCurrentUser</w:t>
+      </w:r>
+      <w:proofErr w:type="spellEnd"/>
+      <w:r>
+        <w:t>();</w:t>
+      </w:r>
+    </w:p>
+    <w:p>
+      <w:r>
+        <w:lastRenderedPageBreak/>
+        <w:t>            if (user) {</w:t>
+      </w:r>
+    </w:p>
+    <w:p>
+      <w:r>
+        <w:t xml:space="preserve">                </w:t>
+      </w:r>
+      <w:proofErr w:type="spellStart"/>
+      <w:proofErr w:type="gramStart"/>
+      <w:r>
+        <w:t>document.getElementById</w:t>
+      </w:r>
+      <w:proofErr w:type="spellEnd"/>
+      <w:proofErr w:type="gramEnd"/>
+      <w:r>
+        <w:t>('</w:t>
+      </w:r>
+      <w:proofErr w:type="spellStart"/>
+      <w:r>
+        <w:t>menuWelcome</w:t>
+      </w:r>
+      <w:proofErr w:type="spellEnd"/>
+      <w:r>
+        <w:t>'</w:t>
+      </w:r>
+      <w:proofErr w:type="gramStart"/>
+      <w:r>
+        <w:t>).</w:t>
+      </w:r>
+      <w:proofErr w:type="spellStart"/>
+      <w:r>
+        <w:t>textContent</w:t>
+      </w:r>
+      <w:proofErr w:type="spellEnd"/>
+      <w:proofErr w:type="gramEnd"/>
+      <w:r>
+        <w:t xml:space="preserve"> = `Welcome, ${</w:t>
+      </w:r>
+      <w:proofErr w:type="gramStart"/>
+      <w:r>
+        <w:t>user.name}`</w:t>
+      </w:r>
+      <w:proofErr w:type="gramEnd"/>
+      <w:r>
+        <w:t>;</w:t>
+      </w:r>
+    </w:p>
+    <w:p>
+      <w:r>
+        <w:t>            }</w:t>
+      </w:r>
+    </w:p>
+    <w:p>
+      <w:r>
+        <w:t>        });</w:t>
+      </w:r>
+    </w:p>
+    <w:p/>
+    <w:p>
+      <w:r>
+        <w:t xml:space="preserve">        function </w:t>
+      </w:r>
+      <w:proofErr w:type="spellStart"/>
+      <w:r>
+        <w:t>renderCategories</w:t>
+      </w:r>
+      <w:proofErr w:type="spellEnd"/>
+      <w:r>
+        <w:t>(library) {</w:t>
+      </w:r>
+    </w:p>
+    <w:p>
+      <w:r>
+        <w:t xml:space="preserve">            </w:t>
+      </w:r>
+      <w:proofErr w:type="spellStart"/>
+      <w:r>
+        <w:t>const</w:t>
+      </w:r>
+      <w:proofErr w:type="spellEnd"/>
+      <w:r>
+        <w:t xml:space="preserve"> container = </w:t>
+      </w:r>
+      <w:proofErr w:type="spellStart"/>
+      <w:proofErr w:type="gramStart"/>
+      <w:r>
+        <w:t>document.getElementById</w:t>
+      </w:r>
+      <w:proofErr w:type="spellEnd"/>
+      <w:proofErr w:type="gramEnd"/>
+      <w:r>
+        <w:t>('categories-container');</w:t>
+      </w:r>
+    </w:p>
+    <w:p>
+      <w:r>
+        <w:t xml:space="preserve">            </w:t>
+      </w:r>
+      <w:proofErr w:type="spellStart"/>
+      <w:proofErr w:type="gramStart"/>
+      <w:r>
+        <w:t>container.innerHTML</w:t>
+      </w:r>
+      <w:proofErr w:type="spellEnd"/>
+      <w:proofErr w:type="gramEnd"/>
+      <w:r>
+        <w:t xml:space="preserve"> = ''; // Clear spinner</w:t>
+      </w:r>
+    </w:p>
+    <w:p/>
+    <w:p>
+      <w:r>
+        <w:t>            // Map through keys (healing, meditation, etc.)</w:t>
+      </w:r>
+    </w:p>
+    <w:p>
+      <w:r>
+        <w:t xml:space="preserve">            </w:t>
+      </w:r>
+      <w:proofErr w:type="spellStart"/>
+      <w:r>
+        <w:t>Object.keys</w:t>
+      </w:r>
+      <w:proofErr w:type="spellEnd"/>
+      <w:r>
+        <w:t>(library</w:t>
+      </w:r>
+      <w:proofErr w:type="gramStart"/>
+      <w:r>
+        <w:t>).</w:t>
+      </w:r>
+      <w:proofErr w:type="spellStart"/>
+      <w:r>
+        <w:t>forEach</w:t>
+      </w:r>
+      <w:proofErr w:type="spellEnd"/>
+      <w:proofErr w:type="gramEnd"/>
+      <w:r>
+        <w:t>((key, index) =&gt; {</w:t>
+      </w:r>
+    </w:p>
+    <w:p>
+      <w:r>
+        <w:t xml:space="preserve">                </w:t>
+      </w:r>
+      <w:proofErr w:type="spellStart"/>
+      <w:r>
+        <w:t>const</w:t>
+      </w:r>
+      <w:proofErr w:type="spellEnd"/>
+      <w:r>
+        <w:t xml:space="preserve"> cat = library[key];</w:t>
+      </w:r>
+    </w:p>
+    <w:p>
+      <w:r>
+        <w:t xml:space="preserve">                </w:t>
+      </w:r>
+      <w:proofErr w:type="spellStart"/>
+      <w:r>
+        <w:t>const</w:t>
+      </w:r>
+      <w:proofErr w:type="spellEnd"/>
+      <w:r>
+        <w:t xml:space="preserve"> </w:t>
+      </w:r>
+      <w:proofErr w:type="spellStart"/>
+      <w:r>
+        <w:t>accordionId</w:t>
+      </w:r>
+      <w:proofErr w:type="spellEnd"/>
+      <w:r>
+        <w:t xml:space="preserve"> = `</w:t>
+      </w:r>
+      <w:proofErr w:type="spellStart"/>
+      <w:r>
+        <w:t>acc</w:t>
+      </w:r>
+      <w:proofErr w:type="spellEnd"/>
+      <w:r>
+        <w:t>-${index}`;</w:t>
+      </w:r>
+    </w:p>
+    <w:p>
+      <w:r>
+        <w:t>                </w:t>
+      </w:r>
+    </w:p>
+    <w:p>
+      <w:r>
+        <w:t xml:space="preserve">                </w:t>
+      </w:r>
+      <w:proofErr w:type="spellStart"/>
+      <w:r>
+        <w:t>const</w:t>
+      </w:r>
+      <w:proofErr w:type="spellEnd"/>
+      <w:r>
+        <w:t xml:space="preserve"> </w:t>
+      </w:r>
+      <w:proofErr w:type="spellStart"/>
+      <w:r>
+        <w:t>cardHtml</w:t>
+      </w:r>
+      <w:proofErr w:type="spellEnd"/>
+      <w:r>
+        <w:t xml:space="preserve"> = `</w:t>
+      </w:r>
+    </w:p>
+    <w:p>
+      <w:r>
+        <w:t>                    &lt;div class="col"&gt;</w:t>
+      </w:r>
+    </w:p>
+    <w:p>
+      <w:r>
+        <w:t>                        &lt;div class="category-card"&gt;</w:t>
+      </w:r>
+    </w:p>
+    <w:p>
+      <w:r>
+        <w:t>                            &lt;div class="accordion" id="parent-${</w:t>
+      </w:r>
+      <w:proofErr w:type="spellStart"/>
+      <w:r>
+        <w:t>accordionId</w:t>
+      </w:r>
+      <w:proofErr w:type="spellEnd"/>
+      <w:r>
+        <w:t>}"&gt;</w:t>
+      </w:r>
+    </w:p>
+    <w:p>
+      <w:r>
+        <w:t>                                &lt;div class="accordion-item"&gt;</w:t>
+      </w:r>
+    </w:p>
+    <w:p>
+      <w:r>
+        <w:t>                                    &lt;h2 class="accordion-header"&gt;</w:t>
+      </w:r>
+    </w:p>
+    <w:p>
+      <w:r>
+        <w:t>                                        &lt;button class="accordion-button collapsed p-4" type="button" data-bs-toggle="collapse" data-bs-target="#collapse-${</w:t>
+      </w:r>
+      <w:proofErr w:type="spellStart"/>
+      <w:r>
+        <w:t>accordionId</w:t>
+      </w:r>
+      <w:proofErr w:type="spellEnd"/>
+      <w:r>
+        <w:t>}"&gt;</w:t>
+      </w:r>
+    </w:p>
+    <w:p>
+      <w:r>
+        <w:t>                                            &lt;div class="d-flex align-items-</w:t>
+      </w:r>
+      <w:proofErr w:type="spellStart"/>
+      <w:r>
+        <w:t>center</w:t>
+      </w:r>
+      <w:proofErr w:type="spellEnd"/>
+      <w:r>
+        <w:t xml:space="preserve"> w-100"&gt;</w:t>
+      </w:r>
+    </w:p>
+    <w:p>
+      <w:r>
+        <w:t>                                                &lt;</w:t>
+      </w:r>
+      <w:proofErr w:type="spellStart"/>
+      <w:r>
+        <w:t>i</w:t>
+      </w:r>
+      <w:proofErr w:type="spellEnd"/>
+      <w:r>
+        <w:t xml:space="preserve"> class="bi ${</w:t>
+      </w:r>
+      <w:proofErr w:type="spellStart"/>
+      <w:proofErr w:type="gramStart"/>
+      <w:r>
+        <w:t>cat.icon</w:t>
+      </w:r>
+      <w:proofErr w:type="spellEnd"/>
+      <w:proofErr w:type="gramEnd"/>
+      <w:r>
+        <w:t>} fs-1 me-4 text-info"&gt;&lt;/</w:t>
+      </w:r>
+      <w:proofErr w:type="spellStart"/>
+      <w:r>
+        <w:t>i</w:t>
+      </w:r>
+      <w:proofErr w:type="spellEnd"/>
+      <w:r>
+        <w:t>&gt;</w:t>
+      </w:r>
+    </w:p>
+    <w:p>
+      <w:r>
+        <w:t>                                                &lt;div class="flex-grow-1 text-start"&gt;</w:t>
+      </w:r>
+    </w:p>
+    <w:p>
+      <w:r>
+        <w:t>                                                    &lt;div class="d-flex justify-content-between align-items-</w:t>
+      </w:r>
+      <w:proofErr w:type="spellStart"/>
+      <w:r>
+        <w:t>center</w:t>
+      </w:r>
+      <w:proofErr w:type="spellEnd"/>
+      <w:r>
+        <w:t xml:space="preserve"> mb-1"&gt;</w:t>
+      </w:r>
+    </w:p>
+    <w:p>
+      <w:r>
+        <w:t xml:space="preserve">                                                        &lt;span class="text-uppercase </w:t>
+      </w:r>
+      <w:proofErr w:type="spellStart"/>
+      <w:r>
+        <w:t>fw</w:t>
+      </w:r>
+      <w:proofErr w:type="spellEnd"/>
+      <w:r>
+        <w:t>-bold ls-1"&gt;${key}&lt;/span&gt;</w:t>
+      </w:r>
+    </w:p>
+    <w:p>
+      <w:r>
+        <w:lastRenderedPageBreak/>
+        <w:t>                                                        &lt;span class="</w:t>
+      </w:r>
+      <w:proofErr w:type="spellStart"/>
+      <w:r>
+        <w:t>hz</w:t>
+      </w:r>
+      <w:proofErr w:type="spellEnd"/>
+      <w:r>
+        <w:t>-badge text-muted"&gt;${</w:t>
+      </w:r>
+      <w:proofErr w:type="spellStart"/>
+      <w:proofErr w:type="gramStart"/>
+      <w:r>
+        <w:t>cat.hz</w:t>
+      </w:r>
+      <w:proofErr w:type="spellEnd"/>
+      <w:proofErr w:type="gramEnd"/>
+      <w:r>
+        <w:t>} Hz&lt;/span&gt;</w:t>
+      </w:r>
+    </w:p>
+    <w:p>
+      <w:r>
+        <w:t>                                                    &lt;/div&gt;</w:t>
+      </w:r>
+    </w:p>
+    <w:p>
+      <w:r>
+        <w:t>                                                    &lt;p class="small text-light m-0 pe-3"&gt;${</w:t>
+      </w:r>
+      <w:proofErr w:type="spellStart"/>
+      <w:proofErr w:type="gramStart"/>
+      <w:r>
+        <w:t>cat.description</w:t>
+      </w:r>
+      <w:proofErr w:type="spellEnd"/>
+      <w:proofErr w:type="gramEnd"/>
+      <w:r>
+        <w:t>}&lt;/p&gt;</w:t>
+      </w:r>
+    </w:p>
+    <w:p>
+      <w:r>
+        <w:t>                                                &lt;/div&gt;</w:t>
+      </w:r>
+    </w:p>
+    <w:p>
+      <w:r>
+        <w:t>                                            &lt;/div&gt;</w:t>
+      </w:r>
+    </w:p>
+    <w:p>
+      <w:r>
+        <w:t>                                        &lt;/button&gt;</w:t>
+      </w:r>
+    </w:p>
+    <w:p>
+      <w:r>
+        <w:t>                                    &lt;/h2&gt;</w:t>
+      </w:r>
+    </w:p>
+    <w:p>
+      <w:r>
+        <w:t>                                    &lt;div id="collapse-${</w:t>
+      </w:r>
+      <w:proofErr w:type="spellStart"/>
+      <w:r>
+        <w:t>accordionId</w:t>
+      </w:r>
+      <w:proofErr w:type="spellEnd"/>
+      <w:r>
+        <w:t>}" class="accordion-collapse collapse" data-bs-parent="#parent-${</w:t>
+      </w:r>
+      <w:proofErr w:type="spellStart"/>
+      <w:r>
+        <w:t>accordionId</w:t>
+      </w:r>
+      <w:proofErr w:type="spellEnd"/>
+      <w:r>
+        <w:t>}"&gt;</w:t>
+      </w:r>
+    </w:p>
+    <w:p>
+      <w:r>
+        <w:t>                                        &lt;div class="accordion-body p-0"&gt;</w:t>
+      </w:r>
+    </w:p>
+    <w:p>
+      <w:r>
+        <w:t>                                            ${</w:t>
+      </w:r>
+      <w:proofErr w:type="spellStart"/>
+      <w:proofErr w:type="gramStart"/>
+      <w:r>
+        <w:t>cat.tracks.map</w:t>
+      </w:r>
+      <w:proofErr w:type="spellEnd"/>
+      <w:r>
+        <w:t>(</w:t>
+      </w:r>
+      <w:proofErr w:type="gramEnd"/>
+      <w:r>
+        <w:t xml:space="preserve">track =&gt; </w:t>
+      </w:r>
+      <w:proofErr w:type="spellStart"/>
+      <w:proofErr w:type="gramStart"/>
+      <w:r>
+        <w:t>renderTrackItem</w:t>
+      </w:r>
+      <w:proofErr w:type="spellEnd"/>
+      <w:r>
+        <w:t>(</w:t>
+      </w:r>
+      <w:proofErr w:type="gramEnd"/>
+      <w:r>
+        <w:t>track, key)</w:t>
+      </w:r>
+      <w:proofErr w:type="gramStart"/>
+      <w:r>
+        <w:t>).join</w:t>
+      </w:r>
+      <w:proofErr w:type="gramEnd"/>
+      <w:r>
+        <w:t>('')}</w:t>
+      </w:r>
+    </w:p>
+    <w:p>
+      <w:r>
+        <w:t>                                        &lt;/div&gt;</w:t>
+      </w:r>
+    </w:p>
+    <w:p>
+      <w:r>
+        <w:t>                                    &lt;/div&gt;</w:t>
+      </w:r>
+    </w:p>
+    <w:p>
+      <w:r>
+        <w:t>                                &lt;/div&gt;</w:t>
+      </w:r>
+    </w:p>
+    <w:p>
+      <w:r>
+        <w:t>                            &lt;/div&gt;</w:t>
+      </w:r>
+    </w:p>
+    <w:p>
+      <w:r>
+        <w:t>                        &lt;/div&gt;</w:t>
+      </w:r>
+    </w:p>
+    <w:p>
+      <w:r>
+        <w:t>                    &lt;/div&gt;</w:t>
+      </w:r>
+    </w:p>
+    <w:p>
+      <w:r>
+        <w:t>                `;</w:t>
+      </w:r>
+    </w:p>
+    <w:p>
+      <w:r>
+        <w:t xml:space="preserve">                </w:t>
+      </w:r>
+      <w:proofErr w:type="spellStart"/>
+      <w:proofErr w:type="gramStart"/>
+      <w:r>
+        <w:t>container.innerHTML</w:t>
+      </w:r>
+      <w:proofErr w:type="spellEnd"/>
+      <w:proofErr w:type="gramEnd"/>
+      <w:r>
+        <w:t xml:space="preserve"> += </w:t>
+      </w:r>
+      <w:proofErr w:type="spellStart"/>
+      <w:r>
+        <w:t>cardHtml</w:t>
+      </w:r>
+      <w:proofErr w:type="spellEnd"/>
+      <w:r>
+        <w:t>;</w:t>
+      </w:r>
+    </w:p>
+    <w:p>
+      <w:r>
+        <w:t>            });</w:t>
+      </w:r>
+    </w:p>
+    <w:p>
+      <w:r>
+        <w:t>        }</w:t>
+      </w:r>
+    </w:p>
+    <w:p/>
+    <w:p>
+      <w:r>
+        <w:t xml:space="preserve">        function </w:t>
+      </w:r>
+      <w:proofErr w:type="spellStart"/>
+      <w:proofErr w:type="gramStart"/>
+      <w:r>
+        <w:t>renderTrackItem</w:t>
+      </w:r>
+      <w:proofErr w:type="spellEnd"/>
+      <w:r>
+        <w:t>(</w:t>
+      </w:r>
+      <w:proofErr w:type="gramEnd"/>
+      <w:r>
+        <w:t>filename, category) {</w:t>
+      </w:r>
+    </w:p>
+    <w:p>
+      <w:r>
+        <w:t>            // Clean up filename for display: "1.healing-forest-compr.mp3" -&gt; "Healing Forest"</w:t>
+      </w:r>
+    </w:p>
+    <w:p>
+      <w:r>
+        <w:t xml:space="preserve">            </w:t>
+      </w:r>
+      <w:proofErr w:type="spellStart"/>
+      <w:r>
+        <w:t>const</w:t>
+      </w:r>
+      <w:proofErr w:type="spellEnd"/>
+      <w:r>
+        <w:t xml:space="preserve"> </w:t>
+      </w:r>
+      <w:proofErr w:type="spellStart"/>
+      <w:r>
+        <w:t>displayTitle</w:t>
+      </w:r>
+      <w:proofErr w:type="spellEnd"/>
+      <w:r>
+        <w:t xml:space="preserve"> = filename</w:t>
+      </w:r>
+    </w:p>
+    <w:p>
+      <w:r>
+        <w:t xml:space="preserve">                </w:t>
+      </w:r>
+      <w:proofErr w:type="gramStart"/>
+      <w:r>
+        <w:t>.replace</w:t>
+      </w:r>
+      <w:proofErr w:type="gramEnd"/>
+      <w:r>
+        <w:t>(/^\d+\./, '') // remove leading numbers and dot</w:t>
+      </w:r>
+    </w:p>
+    <w:p>
+      <w:r>
+        <w:t xml:space="preserve">                </w:t>
+      </w:r>
+      <w:proofErr w:type="gramStart"/>
+      <w:r>
+        <w:t>.replace</w:t>
+      </w:r>
+      <w:proofErr w:type="gramEnd"/>
+      <w:r>
+        <w:t>(/-</w:t>
+      </w:r>
+      <w:proofErr w:type="spellStart"/>
+      <w:r>
+        <w:t>compr</w:t>
+      </w:r>
+      <w:proofErr w:type="spellEnd"/>
+      <w:r>
+        <w:t>\.mp3$/, '') // remove -compr.mp3</w:t>
+      </w:r>
+    </w:p>
+    <w:p>
+      <w:r>
+        <w:t xml:space="preserve">                </w:t>
+      </w:r>
+      <w:proofErr w:type="gramStart"/>
+      <w:r>
+        <w:t>.replace</w:t>
+      </w:r>
+      <w:proofErr w:type="gramEnd"/>
+      <w:r>
+        <w:t>(/-/g, ' ') // replace dashes with spaces</w:t>
+      </w:r>
+    </w:p>
+    <w:p>
+      <w:r>
+        <w:lastRenderedPageBreak/>
+        <w:t xml:space="preserve">                </w:t>
+      </w:r>
+      <w:proofErr w:type="gramStart"/>
+      <w:r>
+        <w:t>.replace</w:t>
+      </w:r>
+      <w:proofErr w:type="gramEnd"/>
+      <w:r>
+        <w:t xml:space="preserve">(/\b\w/g, l =&gt; </w:t>
+      </w:r>
+      <w:proofErr w:type="spellStart"/>
+      <w:proofErr w:type="gramStart"/>
+      <w:r>
+        <w:t>l.toUpperCase</w:t>
+      </w:r>
+      <w:proofErr w:type="spellEnd"/>
+      <w:proofErr w:type="gramEnd"/>
+      <w:r>
+        <w:t>()); // Capitalize words</w:t>
+      </w:r>
+    </w:p>
+    <w:p/>
+    <w:p>
+      <w:r>
+        <w:t>            // URL safe path for the link</w:t>
+      </w:r>
+    </w:p>
+    <w:p>
+      <w:r>
+        <w:t xml:space="preserve">            </w:t>
+      </w:r>
+      <w:proofErr w:type="spellStart"/>
+      <w:r>
+        <w:t>const</w:t>
+      </w:r>
+      <w:proofErr w:type="spellEnd"/>
+      <w:r>
+        <w:t xml:space="preserve"> </w:t>
+      </w:r>
+      <w:proofErr w:type="spellStart"/>
+      <w:r>
+        <w:t>filePath</w:t>
+      </w:r>
+      <w:proofErr w:type="spellEnd"/>
+      <w:r>
+        <w:t xml:space="preserve"> = </w:t>
+      </w:r>
+      <w:proofErr w:type="spellStart"/>
+      <w:r>
+        <w:t>encodeURIComponent</w:t>
+      </w:r>
+      <w:proofErr w:type="spellEnd"/>
+      <w:r>
+        <w:t>(`assets/audio/${filename}`);</w:t>
+      </w:r>
+    </w:p>
+    <w:p/>
+    <w:p>
+      <w:r>
+        <w:t>            return `</w:t>
+      </w:r>
+    </w:p>
+    <w:p>
+      <w:r>
+        <w:t>                &lt;div class="track-item"&gt;</w:t>
+      </w:r>
+    </w:p>
+    <w:p>
+      <w:r>
+        <w:t>                    &lt;div class="d-flex align-items-</w:t>
+      </w:r>
+      <w:proofErr w:type="spellStart"/>
+      <w:r>
+        <w:t>center</w:t>
+      </w:r>
+      <w:proofErr w:type="spellEnd"/>
+      <w:r>
+        <w:t>"&gt;</w:t>
+      </w:r>
+    </w:p>
+    <w:p>
+      <w:r>
+        <w:t>                        &lt;</w:t>
+      </w:r>
+      <w:proofErr w:type="spellStart"/>
+      <w:r>
+        <w:t>i</w:t>
+      </w:r>
+      <w:proofErr w:type="spellEnd"/>
+      <w:r>
+        <w:t xml:space="preserve"> class="bi bi-play-fill fs-4 me-3 text-white-50"&gt;&lt;/</w:t>
+      </w:r>
+      <w:proofErr w:type="spellStart"/>
+      <w:r>
+        <w:t>i</w:t>
+      </w:r>
+      <w:proofErr w:type="spellEnd"/>
+      <w:r>
+        <w:t>&gt;</w:t>
+      </w:r>
+    </w:p>
+    <w:p>
+      <w:r>
+        <w:t>                        &lt;span&gt;${</w:t>
+      </w:r>
+      <w:proofErr w:type="spellStart"/>
+      <w:r>
+        <w:t>displayTitle</w:t>
+      </w:r>
+      <w:proofErr w:type="spellEnd"/>
+      <w:r>
+        <w:t>}&lt;/span&gt;</w:t>
+      </w:r>
+    </w:p>
+    <w:p>
+      <w:r>
+        <w:t>                    &lt;/div&gt;</w:t>
+      </w:r>
+    </w:p>
+    <w:p>
+      <w:r>
+        <w:t>                    &lt;div class="d-flex align-items-</w:t>
+      </w:r>
+      <w:proofErr w:type="spellStart"/>
+      <w:r>
+        <w:t>center</w:t>
+      </w:r>
+      <w:proofErr w:type="spellEnd"/>
+      <w:r>
+        <w:t>"&gt;</w:t>
+      </w:r>
+    </w:p>
+    <w:p>
+      <w:r>
+        <w:t>                        &lt;button class="</w:t>
+      </w:r>
+      <w:proofErr w:type="spellStart"/>
+      <w:r>
+        <w:t>btn</w:t>
+      </w:r>
+      <w:proofErr w:type="spellEnd"/>
+      <w:r>
+        <w:t xml:space="preserve"> </w:t>
+      </w:r>
+      <w:proofErr w:type="spellStart"/>
+      <w:r>
+        <w:t>btn</w:t>
+      </w:r>
+      <w:proofErr w:type="spellEnd"/>
+      <w:r>
+        <w:t>-link text-white-50 p-0 me-3"&gt;</w:t>
+      </w:r>
+    </w:p>
+    <w:p>
+      <w:r>
+        <w:t>                            &lt;</w:t>
+      </w:r>
+      <w:proofErr w:type="spellStart"/>
+      <w:r>
+        <w:t>i</w:t>
+      </w:r>
+      <w:proofErr w:type="spellEnd"/>
+      <w:r>
+        <w:t xml:space="preserve"> class="bi bi-star"&gt;&lt;/</w:t>
+      </w:r>
+      <w:proofErr w:type="spellStart"/>
+      <w:r>
+        <w:t>i</w:t>
+      </w:r>
+      <w:proofErr w:type="spellEnd"/>
+      <w:r>
+        <w:t>&gt;</w:t>
+      </w:r>
+    </w:p>
+    <w:p>
+      <w:r>
+        <w:t>                        &lt;/button&gt;</w:t>
+      </w:r>
+    </w:p>
+    <w:p>
+      <w:r>
+        <w:t xml:space="preserve">                        &lt;a </w:t>
+      </w:r>
+      <w:proofErr w:type="spellStart"/>
+      <w:r>
+        <w:t>href</w:t>
+      </w:r>
+      <w:proofErr w:type="spellEnd"/>
+      <w:r>
+        <w:t>="</w:t>
+      </w:r>
+      <w:proofErr w:type="spellStart"/>
+      <w:r>
+        <w:t>session.html?track</w:t>
+      </w:r>
+      <w:proofErr w:type="spellEnd"/>
+      <w:r>
+        <w:t>=${</w:t>
+      </w:r>
+      <w:proofErr w:type="spellStart"/>
+      <w:r>
+        <w:t>filePath</w:t>
+      </w:r>
+      <w:proofErr w:type="spellEnd"/>
+      <w:r>
+        <w:t>}&amp;cat=${category}" class="</w:t>
+      </w:r>
+      <w:proofErr w:type="spellStart"/>
+      <w:r>
+        <w:t>btn</w:t>
+      </w:r>
+      <w:proofErr w:type="spellEnd"/>
+      <w:r>
+        <w:t xml:space="preserve"> </w:t>
+      </w:r>
+      <w:proofErr w:type="spellStart"/>
+      <w:r>
+        <w:t>btn-sm</w:t>
+      </w:r>
+      <w:proofErr w:type="spellEnd"/>
+      <w:r>
+        <w:t xml:space="preserve"> </w:t>
+      </w:r>
+      <w:proofErr w:type="spellStart"/>
+      <w:r>
+        <w:t>btn</w:t>
+      </w:r>
+      <w:proofErr w:type="spellEnd"/>
+      <w:r>
+        <w:t>-gradient px-3 rounded-pill"&gt;</w:t>
+      </w:r>
+    </w:p>
+    <w:p>
+      <w:r>
+        <w:t>                            Start</w:t>
+      </w:r>
+    </w:p>
+    <w:p>
+      <w:r>
+        <w:t>                        &lt;/a&gt;</w:t>
+      </w:r>
+    </w:p>
+    <w:p>
+      <w:r>
+        <w:t>                    &lt;/div&gt;</w:t>
+      </w:r>
+    </w:p>
+    <w:p>
+      <w:r>
+        <w:t>                &lt;/div&gt;</w:t>
+      </w:r>
+    </w:p>
+    <w:p>
+      <w:r>
+        <w:t>            `;</w:t>
+      </w:r>
+    </w:p>
+    <w:p>
+      <w:r>
+        <w:t>        }</w:t>
+      </w:r>
+    </w:p>
+    <w:p>
+      <w:r>
+        <w:t>    &lt;/script&gt;</w:t>
+      </w:r>
+    </w:p>
+    <w:p>
+      <w:r>
+        <w:t>"</w:t>
+      </w:r>
+    </w:p>
+    <w:p/>
     <w:sectPr>
       <w:pgSz w:w="11906" w:h="16838"/>
       <w:pgMar w:top="1440" w:right="1440" w:bottom="1440" w:left="1440" w:header="708" w:footer="708" w:gutter="0"/>

</xml_diff>